<commit_message>
Actualizacion del documento ESTUDIO DE CASOS
</commit_message>
<xml_diff>
--- a/Actividad_1_TERA_GABRIEL.docx
+++ b/Actividad_1_TERA_GABRIEL.docx
@@ -5069,13 +5069,7 @@
               <w:rPr>
                 <w:rFonts w:ascii="Arial" w:hAnsi="Arial" w:cs="Arial"/>
               </w:rPr>
-              <w:t>L</w:t>
-            </w:r>
-            <w:r>
-              <w:rPr>
-                <w:rFonts w:ascii="Arial" w:hAnsi="Arial" w:cs="Arial"/>
-              </w:rPr>
-              <w:t xml:space="preserve">as implementaciones de </w:t>
+              <w:t xml:space="preserve">Las implementaciones de </w:t>
             </w:r>
             <w:r>
               <w:rPr>
@@ -5169,13 +5163,7 @@
               <w:rPr>
                 <w:rFonts w:ascii="Arial" w:hAnsi="Arial" w:cs="Arial"/>
               </w:rPr>
-              <w:t>S</w:t>
-            </w:r>
-            <w:r>
-              <w:rPr>
-                <w:rFonts w:ascii="Arial" w:hAnsi="Arial" w:cs="Arial"/>
-              </w:rPr>
-              <w:t>e definen interfaces específicas para repositorios, notificaciones y estados.</w:t>
+              <w:t>Se definen interfaces específicas para repositorios, notificaciones y estados.</w:t>
             </w:r>
           </w:p>
         </w:tc>
@@ -5197,13 +5185,7 @@
               <w:rPr>
                 <w:rFonts w:ascii="Arial" w:hAnsi="Arial" w:cs="Arial"/>
               </w:rPr>
-              <w:t>I</w:t>
-            </w:r>
-            <w:r>
-              <w:rPr>
-                <w:rFonts w:ascii="Arial" w:hAnsi="Arial" w:cs="Arial"/>
-              </w:rPr>
-              <w:t>nversión de dependencias (DIP)</w:t>
+              <w:t>Inversión de dependencias (DIP)</w:t>
             </w:r>
           </w:p>
           <w:p>
@@ -5827,6 +5809,267 @@
         <w:t>Evidencias</w:t>
       </w:r>
     </w:p>
+    <w:tbl>
+      <w:tblPr>
+        <w:tblStyle w:val="Tablaconcuadrcula"/>
+        <w:tblW w:w="0" w:type="auto"/>
+        <w:tblLook w:val="04A0" w:firstRow="1" w:lastRow="0" w:firstColumn="1" w:lastColumn="0" w:noHBand="0" w:noVBand="1"/>
+      </w:tblPr>
+      <w:tblGrid>
+        <w:gridCol w:w="8494"/>
+      </w:tblGrid>
+      <w:tr>
+        <w:tc>
+          <w:tcPr>
+            <w:tcW w:w="8494" w:type="dxa"/>
+          </w:tcPr>
+          <w:p>
+            <w:pPr>
+              <w:pStyle w:val="Sinespaciado"/>
+              <w:spacing w:line="360" w:lineRule="auto"/>
+              <w:jc w:val="both"/>
+              <w:rPr>
+                <w:rFonts w:ascii="Arial" w:hAnsi="Arial" w:cs="Arial"/>
+              </w:rPr>
+            </w:pPr>
+            <w:r>
+              <w:rPr>
+                <w:noProof/>
+              </w:rPr>
+              <w:drawing>
+                <wp:inline distT="0" distB="0" distL="0" distR="0" wp14:anchorId="19CB29AD" wp14:editId="220A9908">
+                  <wp:extent cx="3267075" cy="1885950"/>
+                  <wp:effectExtent l="0" t="0" r="9525" b="0"/>
+                  <wp:docPr id="1138667456" name="Imagen 1"/>
+                  <wp:cNvGraphicFramePr>
+                    <a:graphicFrameLocks xmlns:a="http://schemas.openxmlformats.org/drawingml/2006/main" noChangeAspect="1"/>
+                  </wp:cNvGraphicFramePr>
+                  <a:graphic xmlns:a="http://schemas.openxmlformats.org/drawingml/2006/main">
+                    <a:graphicData uri="http://schemas.openxmlformats.org/drawingml/2006/picture">
+                      <pic:pic xmlns:pic="http://schemas.openxmlformats.org/drawingml/2006/picture">
+                        <pic:nvPicPr>
+                          <pic:cNvPr id="1138667456" name=""/>
+                          <pic:cNvPicPr/>
+                        </pic:nvPicPr>
+                        <pic:blipFill rotWithShape="1">
+                          <a:blip r:embed="rId18"/>
+                          <a:srcRect l="5290" t="9409" r="39731" b="34138"/>
+                          <a:stretch>
+                            <a:fillRect/>
+                          </a:stretch>
+                        </pic:blipFill>
+                        <pic:spPr bwMode="auto">
+                          <a:xfrm>
+                            <a:off x="0" y="0"/>
+                            <a:ext cx="3267075" cy="1885950"/>
+                          </a:xfrm>
+                          <a:prstGeom prst="rect">
+                            <a:avLst/>
+                          </a:prstGeom>
+                          <a:ln>
+                            <a:noFill/>
+                          </a:ln>
+                          <a:extLst>
+                            <a:ext uri="{53640926-AAD7-44D8-BBD7-CCE9431645EC}">
+                              <a14:shadowObscured xmlns:a14="http://schemas.microsoft.com/office/drawing/2010/main"/>
+                            </a:ext>
+                          </a:extLst>
+                        </pic:spPr>
+                      </pic:pic>
+                    </a:graphicData>
+                  </a:graphic>
+                </wp:inline>
+              </w:drawing>
+            </w:r>
+          </w:p>
+          <w:p>
+            <w:pPr>
+              <w:pStyle w:val="Sinespaciado"/>
+              <w:spacing w:line="360" w:lineRule="auto"/>
+              <w:jc w:val="both"/>
+              <w:rPr>
+                <w:rFonts w:ascii="Arial" w:hAnsi="Arial" w:cs="Arial"/>
+              </w:rPr>
+            </w:pPr>
+            <w:r>
+              <w:rPr>
+                <w:rFonts w:ascii="Arial" w:hAnsi="Arial" w:cs="Arial"/>
+              </w:rPr>
+              <w:t>Ingreso de códigos que se deben ingresar por primera vez, nombre y correo</w:t>
+            </w:r>
+          </w:p>
+        </w:tc>
+      </w:tr>
+      <w:tr>
+        <w:tc>
+          <w:tcPr>
+            <w:tcW w:w="8494" w:type="dxa"/>
+          </w:tcPr>
+          <w:p>
+            <w:pPr>
+              <w:pStyle w:val="Sinespaciado"/>
+              <w:spacing w:line="360" w:lineRule="auto"/>
+              <w:jc w:val="both"/>
+              <w:rPr>
+                <w:rFonts w:ascii="Arial" w:hAnsi="Arial" w:cs="Arial"/>
+              </w:rPr>
+            </w:pPr>
+            <w:r>
+              <w:rPr>
+                <w:noProof/>
+              </w:rPr>
+              <w:lastRenderedPageBreak/>
+              <w:drawing>
+                <wp:inline distT="0" distB="0" distL="0" distR="0" wp14:anchorId="4A6A85FF" wp14:editId="73A35975">
+                  <wp:extent cx="4552950" cy="2559635"/>
+                  <wp:effectExtent l="0" t="0" r="0" b="0"/>
+                  <wp:docPr id="627992937" name="Imagen 1"/>
+                  <wp:cNvGraphicFramePr>
+                    <a:graphicFrameLocks xmlns:a="http://schemas.openxmlformats.org/drawingml/2006/main" noChangeAspect="1"/>
+                  </wp:cNvGraphicFramePr>
+                  <a:graphic xmlns:a="http://schemas.openxmlformats.org/drawingml/2006/main">
+                    <a:graphicData uri="http://schemas.openxmlformats.org/drawingml/2006/picture">
+                      <pic:pic xmlns:pic="http://schemas.openxmlformats.org/drawingml/2006/picture">
+                        <pic:nvPicPr>
+                          <pic:cNvPr id="627992937" name=""/>
+                          <pic:cNvPicPr/>
+                        </pic:nvPicPr>
+                        <pic:blipFill>
+                          <a:blip r:embed="rId19"/>
+                          <a:stretch>
+                            <a:fillRect/>
+                          </a:stretch>
+                        </pic:blipFill>
+                        <pic:spPr>
+                          <a:xfrm>
+                            <a:off x="0" y="0"/>
+                            <a:ext cx="4581890" cy="2575905"/>
+                          </a:xfrm>
+                          <a:prstGeom prst="rect">
+                            <a:avLst/>
+                          </a:prstGeom>
+                        </pic:spPr>
+                      </pic:pic>
+                    </a:graphicData>
+                  </a:graphic>
+                </wp:inline>
+              </w:drawing>
+            </w:r>
+          </w:p>
+          <w:p>
+            <w:pPr>
+              <w:pStyle w:val="Sinespaciado"/>
+              <w:spacing w:line="360" w:lineRule="auto"/>
+              <w:jc w:val="both"/>
+              <w:rPr>
+                <w:rFonts w:ascii="Arial" w:hAnsi="Arial" w:cs="Arial"/>
+              </w:rPr>
+            </w:pPr>
+            <w:r>
+              <w:rPr>
+                <w:rFonts w:ascii="Arial" w:hAnsi="Arial" w:cs="Arial"/>
+              </w:rPr>
+              <w:t xml:space="preserve">Una vez realizado los </w:t>
+            </w:r>
+            <w:proofErr w:type="gramStart"/>
+            <w:r>
+              <w:rPr>
+                <w:rFonts w:ascii="Arial" w:hAnsi="Arial" w:cs="Arial"/>
+              </w:rPr>
+              <w:t>paso pertinentes</w:t>
+            </w:r>
+            <w:proofErr w:type="gramEnd"/>
+            <w:r>
+              <w:rPr>
+                <w:rFonts w:ascii="Arial" w:hAnsi="Arial" w:cs="Arial"/>
+              </w:rPr>
+              <w:t xml:space="preserve">, se encuentra subido el primer documento al </w:t>
+            </w:r>
+            <w:proofErr w:type="spellStart"/>
+            <w:r>
+              <w:rPr>
+                <w:rFonts w:ascii="Arial" w:hAnsi="Arial" w:cs="Arial"/>
+              </w:rPr>
+              <w:t>git</w:t>
+            </w:r>
+            <w:proofErr w:type="spellEnd"/>
+          </w:p>
+        </w:tc>
+      </w:tr>
+      <w:tr>
+        <w:tc>
+          <w:tcPr>
+            <w:tcW w:w="8494" w:type="dxa"/>
+          </w:tcPr>
+          <w:p>
+            <w:pPr>
+              <w:pStyle w:val="Sinespaciado"/>
+              <w:spacing w:line="360" w:lineRule="auto"/>
+              <w:jc w:val="both"/>
+              <w:rPr>
+                <w:rFonts w:ascii="Arial" w:hAnsi="Arial" w:cs="Arial"/>
+              </w:rPr>
+            </w:pPr>
+            <w:r>
+              <w:rPr>
+                <w:noProof/>
+              </w:rPr>
+              <w:drawing>
+                <wp:inline distT="0" distB="0" distL="0" distR="0" wp14:anchorId="2D026D9D" wp14:editId="5133DB87">
+                  <wp:extent cx="4629150" cy="2602475"/>
+                  <wp:effectExtent l="0" t="0" r="0" b="7620"/>
+                  <wp:docPr id="2025809792" name="Imagen 1"/>
+                  <wp:cNvGraphicFramePr>
+                    <a:graphicFrameLocks xmlns:a="http://schemas.openxmlformats.org/drawingml/2006/main" noChangeAspect="1"/>
+                  </wp:cNvGraphicFramePr>
+                  <a:graphic xmlns:a="http://schemas.openxmlformats.org/drawingml/2006/main">
+                    <a:graphicData uri="http://schemas.openxmlformats.org/drawingml/2006/picture">
+                      <pic:pic xmlns:pic="http://schemas.openxmlformats.org/drawingml/2006/picture">
+                        <pic:nvPicPr>
+                          <pic:cNvPr id="2025809792" name=""/>
+                          <pic:cNvPicPr/>
+                        </pic:nvPicPr>
+                        <pic:blipFill>
+                          <a:blip r:embed="rId20"/>
+                          <a:stretch>
+                            <a:fillRect/>
+                          </a:stretch>
+                        </pic:blipFill>
+                        <pic:spPr>
+                          <a:xfrm>
+                            <a:off x="0" y="0"/>
+                            <a:ext cx="4632653" cy="2604444"/>
+                          </a:xfrm>
+                          <a:prstGeom prst="rect">
+                            <a:avLst/>
+                          </a:prstGeom>
+                        </pic:spPr>
+                      </pic:pic>
+                    </a:graphicData>
+                  </a:graphic>
+                </wp:inline>
+              </w:drawing>
+            </w:r>
+          </w:p>
+          <w:p>
+            <w:pPr>
+              <w:pStyle w:val="Sinespaciado"/>
+              <w:spacing w:line="360" w:lineRule="auto"/>
+              <w:jc w:val="both"/>
+              <w:rPr>
+                <w:rFonts w:ascii="Arial" w:hAnsi="Arial" w:cs="Arial"/>
+              </w:rPr>
+            </w:pPr>
+            <w:r>
+              <w:rPr>
+                <w:rFonts w:ascii="Arial" w:hAnsi="Arial" w:cs="Arial"/>
+              </w:rPr>
+              <w:t>El archivo se encuentra subido y para descargar</w:t>
+            </w:r>
+          </w:p>
+        </w:tc>
+      </w:tr>
+    </w:tbl>
     <w:p>
       <w:pPr>
         <w:pStyle w:val="Sinespaciado"/>
@@ -5837,6 +6080,29 @@
           <w:lang w:eastAsia="es-EC"/>
         </w:rPr>
       </w:pPr>
+      <w:r>
+        <w:rPr>
+          <w:rFonts w:ascii="Arial" w:hAnsi="Arial" w:cs="Arial"/>
+          <w:lang w:eastAsia="es-EC"/>
+        </w:rPr>
+        <w:t xml:space="preserve">Link de </w:t>
+      </w:r>
+      <w:proofErr w:type="spellStart"/>
+      <w:r>
+        <w:rPr>
+          <w:rFonts w:ascii="Arial" w:hAnsi="Arial" w:cs="Arial"/>
+          <w:lang w:eastAsia="es-EC"/>
+        </w:rPr>
+        <w:t>lucidchart</w:t>
+      </w:r>
+      <w:proofErr w:type="spellEnd"/>
+      <w:r>
+        <w:rPr>
+          <w:rFonts w:ascii="Arial" w:hAnsi="Arial" w:cs="Arial"/>
+          <w:lang w:eastAsia="es-EC"/>
+        </w:rPr>
+        <w:t xml:space="preserve">: </w:t>
+      </w:r>
     </w:p>
     <w:p>
       <w:pPr>
@@ -5845,46 +6111,12 @@
         <w:jc w:val="both"/>
         <w:rPr>
           <w:rFonts w:ascii="Arial" w:hAnsi="Arial" w:cs="Arial"/>
-          <w:lang w:eastAsia="es-EC"/>
-        </w:rPr>
-      </w:pPr>
-      <w:r>
-        <w:rPr>
-          <w:rFonts w:ascii="Arial" w:hAnsi="Arial" w:cs="Arial"/>
-          <w:lang w:eastAsia="es-EC"/>
-        </w:rPr>
-        <w:t xml:space="preserve">Link de </w:t>
-      </w:r>
-      <w:proofErr w:type="spellStart"/>
-      <w:r>
-        <w:rPr>
-          <w:rFonts w:ascii="Arial" w:hAnsi="Arial" w:cs="Arial"/>
-          <w:lang w:eastAsia="es-EC"/>
-        </w:rPr>
-        <w:t>lucidchart</w:t>
-      </w:r>
-      <w:proofErr w:type="spellEnd"/>
-      <w:r>
-        <w:rPr>
-          <w:rFonts w:ascii="Arial" w:hAnsi="Arial" w:cs="Arial"/>
-          <w:lang w:eastAsia="es-EC"/>
-        </w:rPr>
-        <w:t xml:space="preserve">: </w:t>
-      </w:r>
-    </w:p>
-    <w:p>
-      <w:pPr>
-        <w:pStyle w:val="Sinespaciado"/>
-        <w:spacing w:line="360" w:lineRule="auto"/>
-        <w:jc w:val="both"/>
-        <w:rPr>
-          <w:rFonts w:ascii="Arial" w:hAnsi="Arial" w:cs="Arial"/>
           <w:sz w:val="16"/>
           <w:szCs w:val="16"/>
           <w:lang w:eastAsia="es-EC"/>
         </w:rPr>
       </w:pPr>
-      <w:hyperlink r:id="rId18" w:history="1">
+      <w:hyperlink r:id="rId21" w:history="1">
         <w:r>
           <w:rPr>
             <w:rStyle w:val="Hipervnculo"/>
@@ -5913,8 +6145,82 @@
         <w:jc w:val="both"/>
         <w:rPr>
           <w:rFonts w:ascii="Arial" w:hAnsi="Arial" w:cs="Arial"/>
-          <w:b/>
-          <w:bCs/>
+          <w:sz w:val="16"/>
+          <w:szCs w:val="16"/>
+          <w:lang w:eastAsia="es-EC"/>
+        </w:rPr>
+      </w:pPr>
+    </w:p>
+    <w:p>
+      <w:pPr>
+        <w:pStyle w:val="Sinespaciado"/>
+        <w:spacing w:line="360" w:lineRule="auto"/>
+        <w:jc w:val="both"/>
+        <w:rPr>
+          <w:rFonts w:ascii="Arial" w:hAnsi="Arial" w:cs="Arial"/>
+          <w:lang w:eastAsia="es-EC"/>
+        </w:rPr>
+      </w:pPr>
+      <w:r>
+        <w:rPr>
+          <w:rFonts w:ascii="Arial" w:hAnsi="Arial" w:cs="Arial"/>
+          <w:lang w:eastAsia="es-EC"/>
+        </w:rPr>
+        <w:t xml:space="preserve">link de </w:t>
+      </w:r>
+      <w:proofErr w:type="spellStart"/>
+      <w:r>
+        <w:rPr>
+          <w:rFonts w:ascii="Arial" w:hAnsi="Arial" w:cs="Arial"/>
+          <w:lang w:eastAsia="es-EC"/>
+        </w:rPr>
+        <w:t>Github</w:t>
+      </w:r>
+      <w:proofErr w:type="spellEnd"/>
+    </w:p>
+    <w:p>
+      <w:pPr>
+        <w:pStyle w:val="Sinespaciado"/>
+        <w:spacing w:line="360" w:lineRule="auto"/>
+        <w:jc w:val="both"/>
+        <w:rPr>
+          <w:rFonts w:ascii="Arial" w:hAnsi="Arial" w:cs="Arial"/>
+          <w:sz w:val="16"/>
+          <w:szCs w:val="16"/>
+          <w:lang w:eastAsia="es-EC"/>
+        </w:rPr>
+      </w:pPr>
+      <w:hyperlink r:id="rId22" w:history="1">
+        <w:r>
+          <w:rPr>
+            <w:rStyle w:val="Hipervnculo"/>
+            <w:rFonts w:ascii="Arial" w:hAnsi="Arial" w:cs="Arial"/>
+            <w:sz w:val="16"/>
+            <w:szCs w:val="16"/>
+            <w:lang w:eastAsia="es-EC"/>
+          </w:rPr>
+          <w:t>https://github.com/GabrielTeranJ/DESARROLLO-DE-SISTEMAS-INF.git</w:t>
+        </w:r>
+      </w:hyperlink>
+      <w:r>
+        <w:rPr>
+          <w:rFonts w:ascii="Arial" w:hAnsi="Arial" w:cs="Arial"/>
+          <w:sz w:val="16"/>
+          <w:szCs w:val="16"/>
+          <w:lang w:eastAsia="es-EC"/>
+        </w:rPr>
+        <w:t xml:space="preserve"> </w:t>
+      </w:r>
+    </w:p>
+    <w:p>
+      <w:pPr>
+        <w:pStyle w:val="Sinespaciado"/>
+        <w:spacing w:line="360" w:lineRule="auto"/>
+        <w:jc w:val="both"/>
+        <w:rPr>
+          <w:rFonts w:ascii="Arial" w:hAnsi="Arial" w:cs="Arial"/>
+          <w:sz w:val="16"/>
+          <w:szCs w:val="16"/>
           <w:lang w:eastAsia="es-EC"/>
         </w:rPr>
       </w:pPr>
@@ -6045,7 +6351,7 @@
         </w:rPr>
         <w:t xml:space="preserve">. </w:t>
       </w:r>
-      <w:hyperlink r:id="rId19" w:history="1">
+      <w:hyperlink r:id="rId23" w:history="1">
         <w:r>
           <w:rPr>
             <w:rStyle w:val="Hipervnculo"/>
@@ -6116,7 +6422,7 @@
       </w:r>
     </w:p>
     <w:sectPr>
-      <w:headerReference w:type="first" r:id="rId20"/>
+      <w:headerReference w:type="first" r:id="rId24"/>
       <w:pgSz w:w="11906" w:h="16838"/>
       <w:pgMar w:top="1417" w:right="1701" w:bottom="1417" w:left="1701" w:header="708" w:footer="708" w:gutter="0"/>
       <w:pgNumType w:start="1"/>
@@ -6988,7 +7294,7 @@
         <v:path o:extrusionok="f" gradientshapeok="t" o:connecttype="rect"/>
         <o:lock v:ext="edit" aspectratio="t"/>
       </v:shapetype>
-      <v:shape id="_x0000_i1236" type="#_x0000_t75" style="width:11.25pt;height:11.25pt" o:bullet="t">
+      <v:shape id="_x0000_i1037" type="#_x0000_t75" style="width:11.25pt;height:11.25pt" o:bullet="t">
         <v:imagedata r:id="rId1" o:title="mso3E28"/>
       </v:shape>
     </w:pict>
@@ -10523,6 +10829,7 @@
   <w:style w:type="character" w:default="1" w:styleId="Fuentedeprrafopredeter">
     <w:name w:val="Default Paragraph Font"/>
     <w:uiPriority w:val="1"/>
+    <w:semiHidden/>
     <w:unhideWhenUsed/>
   </w:style>
   <w:style w:type="table" w:default="1" w:styleId="Tablanormal">

</xml_diff>